<commit_message>
Update bulleted analysis with data, cleaning log and chart findings
Co-Authored-By: Claude Sonnet 5.5 <noreply@anthropic.com>
</commit_message>
<xml_diff>
--- a/Statistical Analysis and Modeling/PAMESA - Bulleted Analysis.docx
+++ b/Statistical Analysis and Modeling/PAMESA - Bulleted Analysis.docx
@@ -13,6 +13,38 @@
     <w:p>
       <w:r>
         <w:t>Model Evaluation of the PH Weather Dataset (December 2024)</w:t>
+      </w:r>
+    </w:p>
+    <w:p>
+      <w:pPr>
+        <w:pStyle w:val="Heading2"/>
+      </w:pPr>
+      <w:r>
+        <w:t>Data Used</w:t>
+      </w:r>
+    </w:p>
+    <w:p>
+      <w:pPr>
+        <w:pStyle w:val="ListBullet"/>
+      </w:pPr>
+      <w:r>
+        <w:t>The dataset has 51,888 weather readings from 138 cities in the Philippines, with exactly 376 readings per city, covering December 1 to 31, 2024.</w:t>
+      </w:r>
+    </w:p>
+    <w:p>
+      <w:pPr>
+        <w:pStyle w:val="ListBullet"/>
+      </w:pPr>
+      <w:r>
+        <w:t>The cleaning log shows no duplicate rows and no repeated city and time pairs, and the values are within normal ranges (humidity 18 to 100%, pressure 1003 to 1020 hPa, temperature 12.89 to 34.14 °C, wind speed 0 to 12.1).</w:t>
+      </w:r>
+    </w:p>
+    <w:p>
+      <w:pPr>
+        <w:pStyle w:val="ListBullet"/>
+      </w:pPr>
+      <w:r>
+        <w:t>Three columns were removed during cleaning: sys.type and sys.id (72.17% missing) and rain.1h (88.19% missing, which could also leak the answer into the model).</w:t>
       </w:r>
     </w:p>
     <w:p>
@@ -76,7 +108,7 @@
         <w:pStyle w:val="ListBullet"/>
       </w:pPr>
       <w:r>
-        <w:t>The ROC-AUC of 0.774 shows that the model can separate rainy and non-rainy rows pretty well.</w:t>
+        <w:t>The ROC curve stays above the random-guess line the whole way (AUC 0.77), so the model can separate rainy and non-rainy rows pretty well.</w:t>
       </w:r>
     </w:p>
     <w:p>
@@ -116,7 +148,7 @@
         <w:pStyle w:val="ListBullet"/>
       </w:pPr>
       <w:r>
-        <w:t>Humidity is the strongest predictor (standardized coefficient -1.63), followed by pressure (-0.68). The other four are close to zero.</w:t>
+        <w:t>Humidity is the strongest predictor (correlation with temperature -0.72, standardized coefficient -1.63), followed by pressure (-0.36, coefficient -0.68). The other four are close to zero.</w:t>
       </w:r>
     </w:p>
     <w:p>
@@ -156,7 +188,7 @@
         <w:pStyle w:val="ListBullet"/>
       </w:pPr>
       <w:r>
-        <w:t>The label is the weather condition at the time of the reading, not the measured rainfall.</w:t>
+        <w:t>The label is the weather condition at the time of the reading, not the measured rainfall, since the rainfall column (rain.1h) was removed during cleaning.</w:t>
       </w:r>
     </w:p>
     <w:p>
@@ -172,7 +204,15 @@
         <w:pStyle w:val="ListBullet"/>
       </w:pPr>
       <w:r>
-        <w:t>The rows are repeated readings from the same cities over time. A random split can put nearly identical neighbouring readings in both train and test, which makes the results look better than they would for new places or dates.</w:t>
+        <w:t>The rows are repeated readings from the same 138 cities over time (376 each). A random split can put nearly identical neighbouring readings in both train and test, which makes the results look better than they would for new places or dates.</w:t>
+      </w:r>
+    </w:p>
+    <w:p>
+      <w:pPr>
+        <w:pStyle w:val="ListBullet"/>
+      </w:pPr>
+      <w:r>
+        <w:t>For Linear, wind speed and wind gust are strongly correlated (0.83), so they overlap and their coefficients should not be read separately.</w:t>
       </w:r>
     </w:p>
     <w:p>

</xml_diff>